<commit_message>
Add markdown version of description of operation
</commit_message>
<xml_diff>
--- a/RACHuTS Profiler 2026 Description of Operations.docx
+++ b/RACHuTS Profiler 2026 Description of Operations.docx
@@ -55,7 +55,13 @@
       </w:r>
       <w:proofErr w:type="spellEnd"/>
       <w:r>
-        <w:t xml:space="preserve"> as possible.   The Profiler is a state machine with three primary modes/states:</w:t>
+        <w:t xml:space="preserve"> as possible.   The Profiler is a state machine with t</w:t>
+      </w:r>
+      <w:r>
+        <w:t>wo</w:t>
+      </w:r>
+      <w:r>
+        <w:t xml:space="preserve"> primary modes/states:</w:t>
       </w:r>
     </w:p>
     <w:p/>
@@ -150,7 +156,21 @@
         </w:numPr>
       </w:pPr>
       <w:r>
-        <w:t xml:space="preserve">Profiler sends status messages every 30 min via LoRa and over the docking connector containing:  Battery Voltage, Battery Temperature, Charge Current, PCB Temperature, Heater Duty Cycle, GPS Lat, Long, Alt, # </w:t>
+        <w:t>Profiler sends status messages every 30 min</w:t>
+      </w:r>
+      <w:r>
+        <w:t xml:space="preserve"> (</w:t>
+      </w:r>
+      <w:proofErr w:type="gramStart"/>
+      <w:r>
+        <w:t xml:space="preserve">configurable) </w:t>
+      </w:r>
+      <w:r>
+        <w:t xml:space="preserve"> via</w:t>
+      </w:r>
+      <w:proofErr w:type="gramEnd"/>
+      <w:r>
+        <w:t xml:space="preserve"> LoRa and over the docking connector containing:  Battery Voltage, Battery Temperature, Charge Current, PCB Temperature, Heater Duty Cycle, GPS Lat, Long, Alt, # </w:t>
       </w:r>
       <w:proofErr w:type="spellStart"/>
       <w:r>
@@ -159,6 +179,17 @@
       <w:proofErr w:type="spellEnd"/>
       <w:r>
         <w:t xml:space="preserve">.  </w:t>
+      </w:r>
+      <w:r>
+        <w:t xml:space="preserve"> These status messages are packaged into </w:t>
+      </w:r>
+      <w:proofErr w:type="spellStart"/>
+      <w:r>
+        <w:t>RACHuTS</w:t>
+      </w:r>
+      <w:proofErr w:type="spellEnd"/>
+      <w:r>
+        <w:t xml:space="preserve"> reports and sent via TM.</w:t>
       </w:r>
     </w:p>
     <w:p>
@@ -213,10 +244,16 @@
         <w:t xml:space="preserve">MEASURE: </w:t>
       </w:r>
       <w:r>
-        <w:t xml:space="preserve">This is the state for performing flight level measurements.  </w:t>
-      </w:r>
-      <w:r>
-        <w:t xml:space="preserve">It assumes that the profiler is docked to the main gondola and the battery is being charged. </w:t>
+        <w:t>This is the state for performing measurement</w:t>
+      </w:r>
+      <w:r>
+        <w:t>s, both while docked as well as for profiling.</w:t>
+      </w:r>
+      <w:r>
+        <w:t xml:space="preserve">  </w:t>
+      </w:r>
+      <w:r>
+        <w:t xml:space="preserve"> </w:t>
       </w:r>
       <w:proofErr w:type="spellStart"/>
       <w:r>
@@ -224,10 +261,39 @@
       </w:r>
       <w:proofErr w:type="spellEnd"/>
       <w:r>
-        <w:t xml:space="preserve"> state is entered through a TC and </w:t>
-      </w:r>
-      <w:r>
-        <w:t xml:space="preserve">will remain in this state until another state is commanded or the battery is depleted.   </w:t>
+        <w:t xml:space="preserve"> state is entered through a </w:t>
+      </w:r>
+      <w:proofErr w:type="spellStart"/>
+      <w:r>
+        <w:t>PUcomm</w:t>
+      </w:r>
+      <w:proofErr w:type="spellEnd"/>
+      <w:r>
+        <w:t xml:space="preserve"> command</w:t>
+      </w:r>
+      <w:r>
+        <w:t xml:space="preserve"> </w:t>
+      </w:r>
+      <w:r>
+        <w:t>which specifies</w:t>
+      </w:r>
+      <w:r>
+        <w:t xml:space="preserve"> </w:t>
+      </w:r>
+      <w:r>
+        <w:t>how long to</w:t>
+      </w:r>
+      <w:r>
+        <w:t xml:space="preserve"> remain in this state</w:t>
+      </w:r>
+      <w:r>
+        <w:t xml:space="preserve"> and the measurement rate.</w:t>
+      </w:r>
+      <w:r>
+        <w:t xml:space="preserve"> </w:t>
+      </w:r>
+      <w:r>
+        <w:t xml:space="preserve"> The profiler remains in this state for the specified duration, until commanded to STANDBY, or until the battery is depleted, at which time it returns to STANDBY.   </w:t>
       </w:r>
     </w:p>
     <w:p>
@@ -239,7 +305,13 @@
         </w:numPr>
       </w:pPr>
       <w:r>
-        <w:t xml:space="preserve">When entering MEASURE, parameters are passed to the profiler indicating which sensors should be powered on, and what the reported measurement rate should be (sensors may report faster than this, but their data is averaged to this rate). </w:t>
+        <w:t>When entering MEASURE, parameters are passed to the profiler indicating</w:t>
+      </w:r>
+      <w:r>
+        <w:t xml:space="preserve"> how long to remain in MEASURE,</w:t>
+      </w:r>
+      <w:r>
+        <w:t xml:space="preserve"> which sensors should be powered on, and what the reported measurement rate should be (sensors may report faster than this, but their data is averaged to this rate). </w:t>
       </w:r>
     </w:p>
     <w:p>
@@ -254,7 +326,13 @@
         <w:t xml:space="preserve">In MEASURE the profiler accumulates </w:t>
       </w:r>
       <w:r>
-        <w:t>data to RAM, and expects an offload request from the mainboard when 8kB of data is accumulated.</w:t>
+        <w:t>data to RAM, and expects an offload request from the mainboard</w:t>
+      </w:r>
+      <w:r>
+        <w:t xml:space="preserve"> before the buffer is full</w:t>
+      </w:r>
+      <w:r>
+        <w:t>.</w:t>
       </w:r>
     </w:p>
     <w:p>
@@ -284,7 +362,7 @@
         <w:t>V_LOW_BATT</w:t>
       </w:r>
       <w:r>
-        <w:t xml:space="preserve"> &amp; V_IN &lt; 13.0V, then profiler switches to STANDBY.    </w:t>
+        <w:t xml:space="preserve"> &amp; V_IN &lt; 13.0V, then profiler switches to STANDBY.  </w:t>
       </w:r>
     </w:p>
     <w:p>
@@ -296,223 +374,588 @@
         </w:numPr>
       </w:pPr>
       <w:r>
-        <w:t xml:space="preserve">On exiting </w:t>
+        <w:t xml:space="preserve">A subsequent GO_MEASURE command while still in the MEASURE mode will extend the duration of the MEASURE period, allowing continuous measurement while </w:t>
       </w:r>
       <w:proofErr w:type="gramStart"/>
       <w:r>
-        <w:t>MEASURE</w:t>
+        <w:t>docked</w:t>
       </w:r>
       <w:proofErr w:type="gramEnd"/>
       <w:r>
-        <w:t xml:space="preserve"> the profiler sends whatever data is available in the telemetry buffer and switches to the new mode (either STANDBY or PROFILE).</w:t>
-      </w:r>
-    </w:p>
-    <w:p>
-      <w:pPr>
-        <w:pStyle w:val="ListParagraph"/>
-        <w:numPr>
-          <w:ilvl w:val="0"/>
+        <w:t xml:space="preserve">. </w:t>
+      </w:r>
+    </w:p>
+    <w:p>
+      <w:pPr>
+        <w:pStyle w:val="ListParagraph"/>
+        <w:numPr>
+          <w:ilvl w:val="1"/>
           <w:numId w:val="2"/>
         </w:numPr>
       </w:pPr>
       <w:r>
+        <w:t xml:space="preserve">The profiler will offload stored data on command from </w:t>
+      </w:r>
+      <w:proofErr w:type="spellStart"/>
+      <w:r>
+        <w:t>StratoRACHuTS</w:t>
+      </w:r>
+      <w:proofErr w:type="spellEnd"/>
+      <w:r>
+        <w:t>.</w:t>
+      </w:r>
+    </w:p>
+    <w:p/>
+    <w:p>
+      <w:r>
+        <w:t xml:space="preserve">Outside of the profiler states, there are several global commands that the profiler need to accept.    </w:t>
+      </w:r>
+    </w:p>
+    <w:p>
+      <w:pPr>
+        <w:pStyle w:val="ListParagraph"/>
+        <w:numPr>
+          <w:ilvl w:val="0"/>
+          <w:numId w:val="3"/>
+        </w:numPr>
+      </w:pPr>
+      <w:r>
+        <w:t>The profiler needs to send any data from the buffer on a ‘SEND_</w:t>
+      </w:r>
+      <w:r>
+        <w:t>RECORDS</w:t>
+      </w:r>
+      <w:r>
+        <w:t>’ command.</w:t>
+      </w:r>
+      <w:r>
+        <w:t xml:space="preserve"> The profiler should send the next 8kB chunk of data (~190 lines), or whatever data is remaining in the buffer, whichever is smaller.</w:t>
+      </w:r>
+    </w:p>
+    <w:p>
+      <w:pPr>
+        <w:pStyle w:val="ListParagraph"/>
+        <w:numPr>
+          <w:ilvl w:val="0"/>
+          <w:numId w:val="3"/>
+        </w:numPr>
+      </w:pPr>
+      <w:r>
+        <w:lastRenderedPageBreak/>
+        <w:t>If no data is available to send after a SEND_</w:t>
+      </w:r>
+      <w:r>
+        <w:t>RECORDS</w:t>
+      </w:r>
+      <w:r>
+        <w:t xml:space="preserve"> command then a ‘NO_MORE_RECORDS’ response should be sent.</w:t>
+      </w:r>
+    </w:p>
+    <w:p>
+      <w:pPr>
+        <w:pStyle w:val="ListParagraph"/>
+        <w:numPr>
+          <w:ilvl w:val="0"/>
+          <w:numId w:val="3"/>
+        </w:numPr>
+      </w:pPr>
+      <w:r>
+        <w:t xml:space="preserve">The </w:t>
+      </w:r>
+      <w:r>
+        <w:t>BATT_</w:t>
+      </w:r>
+      <w:r>
+        <w:t>T_SET</w:t>
+      </w:r>
+      <w:r>
+        <w:t>, V_LOW_BATT</w:t>
+      </w:r>
+      <w:r>
+        <w:t>,</w:t>
+      </w:r>
+      <w:r>
+        <w:t xml:space="preserve"> V_CRIT_BATT</w:t>
+      </w:r>
+      <w:r>
+        <w:t>, STATUS_RATE</w:t>
+      </w:r>
+      <w:r>
+        <w:t xml:space="preserve"> can</w:t>
+      </w:r>
+      <w:r>
+        <w:t xml:space="preserve"> all</w:t>
+      </w:r>
+      <w:r>
+        <w:t xml:space="preserve"> be configured via TC.</w:t>
+      </w:r>
+    </w:p>
+    <w:p>
+      <w:pPr>
+        <w:pStyle w:val="ListParagraph"/>
+        <w:numPr>
+          <w:ilvl w:val="0"/>
+          <w:numId w:val="3"/>
+        </w:numPr>
+      </w:pPr>
+      <w:r>
+        <w:t>The profiler should send the current status on a ‘SEND_STATUS’ request. This can be used to check for a successful dock, or to inquire as to profiler status from the ground via a TC.</w:t>
+      </w:r>
+    </w:p>
+    <w:p>
+      <w:pPr>
+        <w:pStyle w:val="ListParagraph"/>
+        <w:ind w:left="1080"/>
+      </w:pPr>
+    </w:p>
+    <w:p>
+      <w:pPr>
+        <w:pStyle w:val="ListParagraph"/>
+        <w:ind w:left="1080"/>
         <w:rPr>
           <w:b/>
           <w:bCs/>
         </w:rPr>
-        <w:t>PROFILE:</w:t>
-      </w:r>
+      </w:pPr>
       <w:r>
         <w:rPr>
           <w:b/>
           <w:bCs/>
         </w:rPr>
+        <w:t>General Docked Measurement and Profile Sequence:</w:t>
+      </w:r>
+    </w:p>
+    <w:p>
+      <w:pPr>
+        <w:pStyle w:val="ListParagraph"/>
+        <w:ind w:left="1080"/>
+      </w:pPr>
+    </w:p>
+    <w:p>
+      <w:pPr>
+        <w:pStyle w:val="ListParagraph"/>
+        <w:ind w:left="1080"/>
+      </w:pPr>
+      <w:r>
+        <w:t xml:space="preserve">For flight level, or docked, measurements the sequences of operations </w:t>
+      </w:r>
+      <w:proofErr w:type="gramStart"/>
+      <w:r>
+        <w:t>is</w:t>
+      </w:r>
+      <w:proofErr w:type="gramEnd"/>
+      <w:r>
+        <w:t>:</w:t>
+      </w:r>
+    </w:p>
+    <w:p>
+      <w:pPr>
+        <w:pStyle w:val="ListParagraph"/>
+        <w:numPr>
+          <w:ilvl w:val="0"/>
+          <w:numId w:val="4"/>
+        </w:numPr>
+      </w:pPr>
+      <w:r>
+        <w:t xml:space="preserve">A TC is sent from the ground requesting a flight level measurement for a specified duration (can be very long for continuous measurements), at a specified measurement rate with the specified instruments powered on. </w:t>
+      </w:r>
+    </w:p>
+    <w:p>
+      <w:pPr>
+        <w:pStyle w:val="ListParagraph"/>
+        <w:numPr>
+          <w:ilvl w:val="0"/>
+          <w:numId w:val="4"/>
+        </w:numPr>
+      </w:pPr>
+      <w:r>
+        <w:t xml:space="preserve">If the duration is &lt; 1800s (30 min) then </w:t>
+      </w:r>
+      <w:proofErr w:type="spellStart"/>
+      <w:r>
+        <w:t>StratoRACHuTS</w:t>
+      </w:r>
+      <w:proofErr w:type="spellEnd"/>
+      <w:r>
+        <w:t xml:space="preserve"> commands the profiler into MEASURE for the requested time.   If the duration is &gt; 1800s, then </w:t>
+      </w:r>
+      <w:proofErr w:type="spellStart"/>
+      <w:r>
+        <w:t>StratoRACHuTS</w:t>
+      </w:r>
+      <w:proofErr w:type="spellEnd"/>
+      <w:r>
+        <w:t xml:space="preserve"> divides the duration into 1800s chunks, and commands the profiler into measure for 1800+60s.   </w:t>
+      </w:r>
+    </w:p>
+    <w:p>
+      <w:pPr>
+        <w:pStyle w:val="ListParagraph"/>
+        <w:numPr>
+          <w:ilvl w:val="0"/>
+          <w:numId w:val="4"/>
+        </w:numPr>
+      </w:pPr>
+      <w:r>
+        <w:t>After the completion of the measurement duration</w:t>
+      </w:r>
+      <w:r>
+        <w:t>, or after 1800s</w:t>
+      </w:r>
+      <w:r>
+        <w:t>, Strato</w:t>
+      </w:r>
+      <w:proofErr w:type="spellStart"/>
+      <w:r>
+        <w:t>RACHuTS</w:t>
+      </w:r>
+      <w:proofErr w:type="spellEnd"/>
+      <w:r>
+        <w:t xml:space="preserve"> commands SEND_RECORDS repeatedly until no more re</w:t>
+      </w:r>
+      <w:r>
+        <w:t xml:space="preserve">cords remain.  </w:t>
+      </w:r>
+    </w:p>
+    <w:p>
+      <w:pPr>
+        <w:pStyle w:val="ListParagraph"/>
+        <w:numPr>
+          <w:ilvl w:val="0"/>
+          <w:numId w:val="4"/>
+        </w:numPr>
+      </w:pPr>
+      <w:r>
+        <w:t xml:space="preserve">If the duration of the flight level measurement was &gt; 1800s, </w:t>
+      </w:r>
+      <w:proofErr w:type="spellStart"/>
+      <w:r>
+        <w:t>StratoRACHuTS</w:t>
+      </w:r>
+      <w:proofErr w:type="spellEnd"/>
+      <w:r>
+        <w:t xml:space="preserve"> repeats step 2&amp;3 until the duration is up.   The additional 60s added to each MEASURE period allows for a continuous measurement while the current records are downloaded and the next measurement command is sent. </w:t>
+      </w:r>
+    </w:p>
+    <w:p>
+      <w:pPr>
+        <w:pStyle w:val="ListParagraph"/>
+        <w:numPr>
+          <w:ilvl w:val="0"/>
+          <w:numId w:val="4"/>
+        </w:numPr>
+      </w:pPr>
+      <w:r>
+        <w:t xml:space="preserve">At the end of the flight level measurement, the profiler returns to STANDBY. </w:t>
+      </w:r>
+    </w:p>
+    <w:p>
+      <w:pPr>
+        <w:pStyle w:val="ListParagraph"/>
+      </w:pPr>
+    </w:p>
+    <w:p>
+      <w:pPr>
+        <w:pStyle w:val="ListParagraph"/>
+      </w:pPr>
+    </w:p>
+    <w:p>
+      <w:pPr>
+        <w:pStyle w:val="ListParagraph"/>
+      </w:pPr>
+      <w:r>
+        <w:t>For a profile the sequence of operations is:</w:t>
+      </w:r>
+    </w:p>
+    <w:p>
+      <w:pPr>
+        <w:pStyle w:val="ListParagraph"/>
+        <w:numPr>
+          <w:ilvl w:val="0"/>
+          <w:numId w:val="5"/>
+        </w:numPr>
+      </w:pPr>
+      <w:r>
+        <w:t xml:space="preserve">A TC is sent from the ground requesting a profile, with a specific length, </w:t>
+      </w:r>
+      <w:proofErr w:type="spellStart"/>
+      <w:r>
+        <w:t>preprofile</w:t>
+      </w:r>
+      <w:proofErr w:type="spellEnd"/>
+      <w:r>
+        <w:t xml:space="preserve"> and dwell time, which instruments should be powered on</w:t>
+      </w:r>
+      <w:r>
+        <w:t xml:space="preserve"> and the measurement rate</w:t>
+      </w:r>
+      <w:r>
+        <w:t>.</w:t>
+      </w:r>
+    </w:p>
+    <w:p>
+      <w:pPr>
+        <w:pStyle w:val="ListParagraph"/>
+        <w:numPr>
+          <w:ilvl w:val="0"/>
+          <w:numId w:val="5"/>
+        </w:numPr>
+      </w:pPr>
+      <w:proofErr w:type="spellStart"/>
+      <w:r>
+        <w:t>StratoRACHuTS</w:t>
+      </w:r>
+      <w:proofErr w:type="spellEnd"/>
+      <w:r>
+        <w:t xml:space="preserve"> receives this command, and requests a </w:t>
+      </w:r>
+      <w:proofErr w:type="spellStart"/>
+      <w:r>
+        <w:t>RACHuTS</w:t>
+      </w:r>
+      <w:proofErr w:type="spellEnd"/>
+      <w:r>
+        <w:t xml:space="preserve"> Authorization (RA) from the Zephyr OBC. </w:t>
+      </w:r>
+    </w:p>
+    <w:p>
+      <w:pPr>
+        <w:pStyle w:val="ListParagraph"/>
+        <w:numPr>
+          <w:ilvl w:val="0"/>
+          <w:numId w:val="5"/>
+        </w:numPr>
+      </w:pPr>
+      <w:r>
+        <w:t xml:space="preserve">If an </w:t>
+      </w:r>
+      <w:proofErr w:type="spellStart"/>
+      <w:r>
+        <w:t>RAAck</w:t>
+      </w:r>
+      <w:proofErr w:type="spellEnd"/>
+      <w:r>
+        <w:t xml:space="preserve"> is received, a profile can commence.  </w:t>
+      </w:r>
+      <w:r>
         <w:t xml:space="preserve"> </w:t>
       </w:r>
-      <w:r>
-        <w:t xml:space="preserve">This is the state for performing profiles.  The state is entered through a TC from the mainboard and remains in this state for the specified duration, or until the battery is depleted. </w:t>
-      </w:r>
-    </w:p>
-    <w:p>
-      <w:pPr>
-        <w:pStyle w:val="ListParagraph"/>
-        <w:numPr>
-          <w:ilvl w:val="1"/>
-          <w:numId w:val="2"/>
-        </w:numPr>
-      </w:pPr>
-      <w:r>
-        <w:t xml:space="preserve">When entering PROFILE, parameters are passed to the profiler indicating which sensors should be powered on, what the reported measurement rate should be, and what the expected profile duration is. </w:t>
-      </w:r>
-    </w:p>
-    <w:p>
-      <w:pPr>
-        <w:pStyle w:val="ListParagraph"/>
-        <w:numPr>
-          <w:ilvl w:val="1"/>
-          <w:numId w:val="2"/>
-        </w:numPr>
-      </w:pPr>
-      <w:r>
-        <w:t>Upon entering PROFILE, the profiler immediately turns on the requested sensors and begins collecting and storing data.  Management of a ‘pre profile’ warm up period is done by the Mainboard.</w:t>
-      </w:r>
-    </w:p>
-    <w:p>
-      <w:pPr>
-        <w:pStyle w:val="ListParagraph"/>
-        <w:numPr>
-          <w:ilvl w:val="1"/>
-          <w:numId w:val="2"/>
-        </w:numPr>
-      </w:pPr>
-      <w:r>
-        <w:t xml:space="preserve">Upon entering </w:t>
+      <w:proofErr w:type="spellStart"/>
+      <w:r>
+        <w:t>StratoRACHuTS</w:t>
+      </w:r>
+      <w:proofErr w:type="spellEnd"/>
+      <w:r>
+        <w:t xml:space="preserve"> calculates the total </w:t>
+      </w:r>
+      <w:proofErr w:type="spellStart"/>
+      <w:r>
+        <w:t>preprofile</w:t>
+      </w:r>
+      <w:proofErr w:type="spellEnd"/>
+      <w:r>
+        <w:t xml:space="preserve"> + descent + dwell + ascent time and commands the profiler to MEASURE mode for this duration with the appropriate configuration. </w:t>
+      </w:r>
+    </w:p>
+    <w:p>
+      <w:pPr>
+        <w:pStyle w:val="ListParagraph"/>
+        <w:numPr>
+          <w:ilvl w:val="0"/>
+          <w:numId w:val="5"/>
+        </w:numPr>
+      </w:pPr>
+      <w:proofErr w:type="spellStart"/>
+      <w:r>
+        <w:t>StratoRACHuTS</w:t>
+      </w:r>
+      <w:proofErr w:type="spellEnd"/>
+      <w:r>
+        <w:t xml:space="preserve"> waits for the </w:t>
+      </w:r>
+      <w:proofErr w:type="spellStart"/>
+      <w:r>
+        <w:t>preprofile</w:t>
+      </w:r>
+      <w:proofErr w:type="spellEnd"/>
+      <w:r>
+        <w:t xml:space="preserve"> duration.</w:t>
+      </w:r>
+    </w:p>
+    <w:p>
+      <w:pPr>
+        <w:pStyle w:val="ListParagraph"/>
+        <w:numPr>
+          <w:ilvl w:val="0"/>
+          <w:numId w:val="5"/>
+        </w:numPr>
+      </w:pPr>
+      <w:proofErr w:type="spellStart"/>
+      <w:r>
+        <w:t>StratoRACHuTS</w:t>
+      </w:r>
+      <w:proofErr w:type="spellEnd"/>
+      <w:r>
+        <w:t xml:space="preserve"> turns the power to the docking connector off, and commands the MCB to reel out the descent distance.  </w:t>
+      </w:r>
+    </w:p>
+    <w:p>
+      <w:pPr>
+        <w:pStyle w:val="ListParagraph"/>
+        <w:numPr>
+          <w:ilvl w:val="0"/>
+          <w:numId w:val="5"/>
+        </w:numPr>
+      </w:pPr>
+      <w:r>
+        <w:t xml:space="preserve">On completion of the reel out, </w:t>
+      </w:r>
+      <w:proofErr w:type="spellStart"/>
+      <w:r>
+        <w:t>StratoRACHuTS</w:t>
+      </w:r>
+      <w:proofErr w:type="spellEnd"/>
+      <w:r>
+        <w:t xml:space="preserve"> sends the MCB motion data TMs (or in real time if configured) and waits for the dwell period.</w:t>
+      </w:r>
+    </w:p>
+    <w:p>
+      <w:pPr>
+        <w:pStyle w:val="ListParagraph"/>
+        <w:numPr>
+          <w:ilvl w:val="0"/>
+          <w:numId w:val="5"/>
+        </w:numPr>
+      </w:pPr>
+      <w:proofErr w:type="spellStart"/>
+      <w:r>
+        <w:t>StratoRACHuTS</w:t>
+      </w:r>
+      <w:proofErr w:type="spellEnd"/>
+      <w:r>
+        <w:t xml:space="preserve"> commands the MCB to reel in 98% (check this) of the descent distance.</w:t>
+      </w:r>
+    </w:p>
+    <w:p>
+      <w:pPr>
+        <w:pStyle w:val="ListParagraph"/>
+        <w:numPr>
+          <w:ilvl w:val="0"/>
+          <w:numId w:val="5"/>
+        </w:numPr>
+      </w:pPr>
+      <w:r>
+        <w:lastRenderedPageBreak/>
+        <w:t xml:space="preserve">On completion of the reel in, </w:t>
+      </w:r>
+      <w:proofErr w:type="spellStart"/>
+      <w:r>
+        <w:t>StratoRACHuTS</w:t>
+      </w:r>
+      <w:proofErr w:type="spellEnd"/>
+      <w:r>
+        <w:t xml:space="preserve"> send the MCB motion data TMs (or in real time) and sends a dock command to the MCB for 2 x the remaining distance. </w:t>
+      </w:r>
+    </w:p>
+    <w:p>
+      <w:pPr>
+        <w:pStyle w:val="ListParagraph"/>
+        <w:numPr>
+          <w:ilvl w:val="0"/>
+          <w:numId w:val="5"/>
+        </w:numPr>
+      </w:pPr>
+      <w:r>
+        <w:t xml:space="preserve">On completion of the dock motion, </w:t>
+      </w:r>
+      <w:proofErr w:type="spellStart"/>
+      <w:r>
+        <w:t>StratoRACHuTS</w:t>
+      </w:r>
+      <w:proofErr w:type="spellEnd"/>
+      <w:r>
+        <w:t xml:space="preserve"> sends a ‘SEND_STATUS’ command to the profiler. </w:t>
+      </w:r>
+    </w:p>
+    <w:p>
+      <w:pPr>
+        <w:pStyle w:val="ListParagraph"/>
+        <w:numPr>
+          <w:ilvl w:val="0"/>
+          <w:numId w:val="5"/>
+        </w:numPr>
+      </w:pPr>
+      <w:r>
+        <w:t xml:space="preserve">If the Profiler does not </w:t>
       </w:r>
       <w:proofErr w:type="gramStart"/>
       <w:r>
-        <w:t>PROFILE</w:t>
-      </w:r>
+        <w:t xml:space="preserve">respond,  </w:t>
+      </w:r>
+      <w:proofErr w:type="spellStart"/>
+      <w:r>
+        <w:t>StratoRACHuTS</w:t>
+      </w:r>
+      <w:proofErr w:type="spellEnd"/>
       <w:proofErr w:type="gramEnd"/>
       <w:r>
-        <w:t xml:space="preserve"> the charger is turned off in expectation of a disconnect from the docking connector.</w:t>
-      </w:r>
-      <w:r>
-        <w:t xml:space="preserve">  Before commencing a reel operation, the </w:t>
-      </w:r>
-      <w:r>
-        <w:lastRenderedPageBreak/>
-        <w:t xml:space="preserve">mainboard turns off the power to the docking connector to prevent arcing and keeps it off until communications </w:t>
-      </w:r>
-      <w:proofErr w:type="gramStart"/>
-      <w:r>
-        <w:t>is</w:t>
-      </w:r>
-      <w:proofErr w:type="gramEnd"/>
-      <w:r>
-        <w:t xml:space="preserve"> reestablished with the profiler.</w:t>
-      </w:r>
-    </w:p>
-    <w:p>
-      <w:pPr>
-        <w:pStyle w:val="ListParagraph"/>
-        <w:numPr>
-          <w:ilvl w:val="1"/>
-          <w:numId w:val="2"/>
-        </w:numPr>
-      </w:pPr>
-      <w:r>
-        <w:t xml:space="preserve">All collected data frames during PROFILE are stored to RAM.  It is the responsibility of the main board in ensure there is sufficient RAM for the configured duration and data rate.  On an overflow condition, the buffer wraps back to the beginning. </w:t>
-      </w:r>
-    </w:p>
-    <w:p>
-      <w:pPr>
-        <w:pStyle w:val="ListParagraph"/>
-        <w:numPr>
-          <w:ilvl w:val="1"/>
-          <w:numId w:val="2"/>
-        </w:numPr>
-      </w:pPr>
-      <w:r>
-        <w:t>Status messages are sent via LoRa every 30 min (see STANDBY).</w:t>
-      </w:r>
-    </w:p>
-    <w:p>
-      <w:pPr>
-        <w:pStyle w:val="ListParagraph"/>
-        <w:numPr>
-          <w:ilvl w:val="1"/>
-          <w:numId w:val="2"/>
-        </w:numPr>
-      </w:pPr>
-      <w:r>
-        <w:t>At the end of the profile time period, the profiler returns to STANDBY</w:t>
-      </w:r>
-      <w:r>
-        <w:t xml:space="preserve"> sends a status message and waits for data offload commands and mode change commands.</w:t>
-      </w:r>
-    </w:p>
-    <w:p>
-      <w:pPr>
-        <w:pStyle w:val="ListParagraph"/>
-        <w:ind w:left="1440"/>
-      </w:pPr>
-    </w:p>
-    <w:p>
-      <w:r>
-        <w:t xml:space="preserve">Outside of the profiler states, there are several global commands that the profiler need to accept.    </w:t>
-      </w:r>
-    </w:p>
-    <w:p>
-      <w:pPr>
-        <w:pStyle w:val="ListParagraph"/>
-        <w:numPr>
-          <w:ilvl w:val="0"/>
-          <w:numId w:val="3"/>
-        </w:numPr>
-      </w:pPr>
-      <w:r>
-        <w:t>The profiler should ACK an empty message in order to confirm communications.</w:t>
-      </w:r>
-      <w:r>
-        <w:t xml:space="preserve"> This allows the main board to know when to turn power on to the profiler after a docking maneuver.</w:t>
-      </w:r>
-      <w:r>
-        <w:t xml:space="preserve"> </w:t>
-      </w:r>
-    </w:p>
-    <w:p>
-      <w:pPr>
-        <w:pStyle w:val="ListParagraph"/>
-        <w:numPr>
-          <w:ilvl w:val="0"/>
-          <w:numId w:val="3"/>
-        </w:numPr>
-      </w:pPr>
-      <w:r>
-        <w:t>The profiler needs to send any data from the buffer on a ‘SEND_DATA’ command.</w:t>
-      </w:r>
-    </w:p>
-    <w:p>
-      <w:pPr>
-        <w:pStyle w:val="ListParagraph"/>
-        <w:numPr>
-          <w:ilvl w:val="0"/>
-          <w:numId w:val="3"/>
-        </w:numPr>
-      </w:pPr>
-      <w:r>
-        <w:t>If no data is available to send after a SEND_DATA command then a ‘NO_MORE_RECORDS’ response should be sent.</w:t>
-      </w:r>
-    </w:p>
-    <w:p>
-      <w:pPr>
-        <w:pStyle w:val="ListParagraph"/>
-        <w:numPr>
-          <w:ilvl w:val="0"/>
-          <w:numId w:val="3"/>
-        </w:numPr>
-      </w:pPr>
-      <w:r>
-        <w:t xml:space="preserve">The </w:t>
-      </w:r>
-      <w:r>
-        <w:t>BATT_</w:t>
-      </w:r>
-      <w:r>
-        <w:t>T_SET</w:t>
-      </w:r>
-      <w:r>
-        <w:t>, V_LOW_BATT and V_CRIT_BATT</w:t>
-      </w:r>
-      <w:r>
-        <w:t xml:space="preserve"> can</w:t>
-      </w:r>
-      <w:r>
-        <w:t xml:space="preserve"> all</w:t>
-      </w:r>
-      <w:r>
-        <w:t xml:space="preserve"> be configured via TC.</w:t>
-      </w:r>
+        <w:t xml:space="preserve"> send the MCB a re-dock command (3x). </w:t>
+      </w:r>
+    </w:p>
+    <w:p>
+      <w:pPr>
+        <w:pStyle w:val="ListParagraph"/>
+        <w:numPr>
+          <w:ilvl w:val="0"/>
+          <w:numId w:val="5"/>
+        </w:numPr>
+      </w:pPr>
+      <w:r>
+        <w:t xml:space="preserve">Once communication is established, </w:t>
+      </w:r>
+      <w:proofErr w:type="spellStart"/>
+      <w:r>
+        <w:t>StratoRACHuTS</w:t>
+      </w:r>
+      <w:proofErr w:type="spellEnd"/>
+      <w:r>
+        <w:t xml:space="preserve"> turns on the power to the docking connector. </w:t>
+      </w:r>
+    </w:p>
+    <w:p>
+      <w:pPr>
+        <w:pStyle w:val="ListParagraph"/>
+        <w:numPr>
+          <w:ilvl w:val="0"/>
+          <w:numId w:val="5"/>
+        </w:numPr>
+      </w:pPr>
+      <w:proofErr w:type="spellStart"/>
+      <w:r>
+        <w:t>StratoRACHuTS</w:t>
+      </w:r>
+      <w:proofErr w:type="spellEnd"/>
+      <w:r>
+        <w:t xml:space="preserve"> sends the profiler SEND_RECORDS commands until no more records are available. </w:t>
+      </w:r>
+    </w:p>
+    <w:p>
+      <w:pPr>
+        <w:pStyle w:val="ListParagraph"/>
+        <w:numPr>
+          <w:ilvl w:val="0"/>
+          <w:numId w:val="5"/>
+        </w:numPr>
+      </w:pPr>
+      <w:r>
+        <w:t>At this point the profiler will be in STANDBY as MEASURE has timed out and can remain here until the next operation is commanded.</w:t>
+      </w:r>
+    </w:p>
+    <w:p>
+      <w:pPr>
+        <w:pStyle w:val="ListParagraph"/>
+        <w:ind w:left="1080"/>
+      </w:pPr>
     </w:p>
     <w:sectPr>
       <w:pgSz w:w="12240" w:h="15840"/>
@@ -527,6 +970,95 @@
 <file path=word/numbering.xml><?xml version="1.0" encoding="utf-8"?>
 <w:numbering xmlns:wpc="http://schemas.microsoft.com/office/word/2010/wordprocessingCanvas" xmlns:cx="http://schemas.microsoft.com/office/drawing/2014/chartex" xmlns:cx1="http://schemas.microsoft.com/office/drawing/2015/9/8/chartex" xmlns:cx2="http://schemas.microsoft.com/office/drawing/2015/10/21/chartex" xmlns:cx3="http://schemas.microsoft.com/office/drawing/2016/5/9/chartex" xmlns:cx4="http://schemas.microsoft.com/office/drawing/2016/5/10/chartex" xmlns:cx5="http://schemas.microsoft.com/office/drawing/2016/5/11/chartex" xmlns:cx6="http://schemas.microsoft.com/office/drawing/2016/5/12/chartex" xmlns:cx7="http://schemas.microsoft.com/office/drawing/2016/5/13/chartex" xmlns:cx8="http://schemas.microsoft.com/office/drawing/2016/5/14/chartex" xmlns:mc="http://schemas.openxmlformats.org/markup-compatibility/2006" xmlns:aink="http://schemas.microsoft.com/office/drawing/2016/ink" xmlns:am3d="http://schemas.microsoft.com/office/drawing/2017/model3d" xmlns:o="urn:schemas-microsoft-com:office:office" xmlns:oel="http://schemas.microsoft.com/office/2019/extlst" xmlns:r="http://schemas.openxmlformats.org/officeDocument/2006/relationships" xmlns:m="http://schemas.openxmlformats.org/officeDocument/2006/math" xmlns:v="urn:schemas-microsoft-com:vml" xmlns:wp14="http://schemas.microsoft.com/office/word/2010/wordprocessingDrawing" xmlns:wp="http://schemas.openxmlformats.org/drawingml/2006/wordprocessingDrawing" xmlns:w10="urn:schemas-microsoft-com:office:word" xmlns:w="http://schemas.openxmlformats.org/wordprocessingml/2006/main" xmlns:w14="http://schemas.microsoft.com/office/word/2010/wordml" xmlns:w15="http://schemas.microsoft.com/office/word/2012/wordml" xmlns:w16cex="http://schemas.microsoft.com/office/word/2018/wordml/cex" xmlns:w16cid="http://schemas.microsoft.com/office/word/2016/wordml/cid" xmlns:w16="http://schemas.microsoft.com/office/word/2018/wordml" xmlns:w16sdtdh="http://schemas.microsoft.com/office/word/2020/wordml/sdtdatahash" xmlns:w16se="http://schemas.microsoft.com/office/word/2015/wordml/symex" xmlns:wpg="http://schemas.microsoft.com/office/word/2010/wordprocessingGroup" xmlns:wpi="http://schemas.microsoft.com/office/word/2010/wordprocessingInk" xmlns:wne="http://schemas.microsoft.com/office/word/2006/wordml" xmlns:wps="http://schemas.microsoft.com/office/word/2010/wordprocessingShape" mc:Ignorable="w14 w15 w16se w16cid w16 w16cex w16sdtdh wp14">
   <w:abstractNum w:abstractNumId="0" w15:restartNumberingAfterBreak="0">
+    <w:nsid w:val="01CB6729"/>
+    <w:multiLevelType w:val="hybridMultilevel"/>
+    <w:tmpl w:val="49AE2CAA"/>
+    <w:lvl w:ilvl="0" w:tplc="0409000F">
+      <w:start w:val="1"/>
+      <w:numFmt w:val="decimal"/>
+      <w:lvlText w:val="%1."/>
+      <w:lvlJc w:val="left"/>
+      <w:pPr>
+        <w:ind w:left="720" w:hanging="360"/>
+      </w:pPr>
+      <w:rPr>
+        <w:rFonts w:hint="default"/>
+      </w:rPr>
+    </w:lvl>
+    <w:lvl w:ilvl="1" w:tplc="FFFFFFFF" w:tentative="1">
+      <w:start w:val="1"/>
+      <w:numFmt w:val="lowerLetter"/>
+      <w:lvlText w:val="%2."/>
+      <w:lvlJc w:val="left"/>
+      <w:pPr>
+        <w:ind w:left="1800" w:hanging="360"/>
+      </w:pPr>
+    </w:lvl>
+    <w:lvl w:ilvl="2" w:tplc="FFFFFFFF" w:tentative="1">
+      <w:start w:val="1"/>
+      <w:numFmt w:val="lowerRoman"/>
+      <w:lvlText w:val="%3."/>
+      <w:lvlJc w:val="right"/>
+      <w:pPr>
+        <w:ind w:left="2520" w:hanging="180"/>
+      </w:pPr>
+    </w:lvl>
+    <w:lvl w:ilvl="3" w:tplc="FFFFFFFF" w:tentative="1">
+      <w:start w:val="1"/>
+      <w:numFmt w:val="decimal"/>
+      <w:lvlText w:val="%4."/>
+      <w:lvlJc w:val="left"/>
+      <w:pPr>
+        <w:ind w:left="3240" w:hanging="360"/>
+      </w:pPr>
+    </w:lvl>
+    <w:lvl w:ilvl="4" w:tplc="FFFFFFFF" w:tentative="1">
+      <w:start w:val="1"/>
+      <w:numFmt w:val="lowerLetter"/>
+      <w:lvlText w:val="%5."/>
+      <w:lvlJc w:val="left"/>
+      <w:pPr>
+        <w:ind w:left="3960" w:hanging="360"/>
+      </w:pPr>
+    </w:lvl>
+    <w:lvl w:ilvl="5" w:tplc="FFFFFFFF" w:tentative="1">
+      <w:start w:val="1"/>
+      <w:numFmt w:val="lowerRoman"/>
+      <w:lvlText w:val="%6."/>
+      <w:lvlJc w:val="right"/>
+      <w:pPr>
+        <w:ind w:left="4680" w:hanging="180"/>
+      </w:pPr>
+    </w:lvl>
+    <w:lvl w:ilvl="6" w:tplc="FFFFFFFF" w:tentative="1">
+      <w:start w:val="1"/>
+      <w:numFmt w:val="decimal"/>
+      <w:lvlText w:val="%7."/>
+      <w:lvlJc w:val="left"/>
+      <w:pPr>
+        <w:ind w:left="5400" w:hanging="360"/>
+      </w:pPr>
+    </w:lvl>
+    <w:lvl w:ilvl="7" w:tplc="FFFFFFFF" w:tentative="1">
+      <w:start w:val="1"/>
+      <w:numFmt w:val="lowerLetter"/>
+      <w:lvlText w:val="%8."/>
+      <w:lvlJc w:val="left"/>
+      <w:pPr>
+        <w:ind w:left="6120" w:hanging="360"/>
+      </w:pPr>
+    </w:lvl>
+    <w:lvl w:ilvl="8" w:tplc="FFFFFFFF" w:tentative="1">
+      <w:start w:val="1"/>
+      <w:numFmt w:val="lowerRoman"/>
+      <w:lvlText w:val="%9."/>
+      <w:lvlJc w:val="right"/>
+      <w:pPr>
+        <w:ind w:left="6840" w:hanging="180"/>
+      </w:pPr>
+    </w:lvl>
+  </w:abstractNum>
+  <w:abstractNum w:abstractNumId="1" w15:restartNumberingAfterBreak="0">
     <w:nsid w:val="1EF7326A"/>
     <w:multiLevelType w:val="hybridMultilevel"/>
     <w:tmpl w:val="A4BA19C6"/>
@@ -615,10 +1147,10 @@
       </w:pPr>
     </w:lvl>
   </w:abstractNum>
-  <w:abstractNum w:abstractNumId="1" w15:restartNumberingAfterBreak="0">
+  <w:abstractNum w:abstractNumId="2" w15:restartNumberingAfterBreak="0">
     <w:nsid w:val="1F5F3CAD"/>
     <w:multiLevelType w:val="hybridMultilevel"/>
-    <w:tmpl w:val="0460383E"/>
+    <w:tmpl w:val="EF4E4A80"/>
     <w:lvl w:ilvl="0" w:tplc="8830194E">
       <w:start w:val="1"/>
       <w:numFmt w:val="lowerLetter"/>
@@ -704,7 +1236,96 @@
       </w:pPr>
     </w:lvl>
   </w:abstractNum>
-  <w:abstractNum w:abstractNumId="2" w15:restartNumberingAfterBreak="0">
+  <w:abstractNum w:abstractNumId="3" w15:restartNumberingAfterBreak="0">
+    <w:nsid w:val="5B04744D"/>
+    <w:multiLevelType w:val="hybridMultilevel"/>
+    <w:tmpl w:val="08F4D9A4"/>
+    <w:lvl w:ilvl="0" w:tplc="CFE88800">
+      <w:start w:val="1"/>
+      <w:numFmt w:val="decimal"/>
+      <w:lvlText w:val="%1."/>
+      <w:lvlJc w:val="left"/>
+      <w:pPr>
+        <w:ind w:left="1080" w:hanging="360"/>
+      </w:pPr>
+      <w:rPr>
+        <w:rFonts w:hint="default"/>
+      </w:rPr>
+    </w:lvl>
+    <w:lvl w:ilvl="1" w:tplc="04090019" w:tentative="1">
+      <w:start w:val="1"/>
+      <w:numFmt w:val="lowerLetter"/>
+      <w:lvlText w:val="%2."/>
+      <w:lvlJc w:val="left"/>
+      <w:pPr>
+        <w:ind w:left="1800" w:hanging="360"/>
+      </w:pPr>
+    </w:lvl>
+    <w:lvl w:ilvl="2" w:tplc="0409001B" w:tentative="1">
+      <w:start w:val="1"/>
+      <w:numFmt w:val="lowerRoman"/>
+      <w:lvlText w:val="%3."/>
+      <w:lvlJc w:val="right"/>
+      <w:pPr>
+        <w:ind w:left="2520" w:hanging="180"/>
+      </w:pPr>
+    </w:lvl>
+    <w:lvl w:ilvl="3" w:tplc="0409000F" w:tentative="1">
+      <w:start w:val="1"/>
+      <w:numFmt w:val="decimal"/>
+      <w:lvlText w:val="%4."/>
+      <w:lvlJc w:val="left"/>
+      <w:pPr>
+        <w:ind w:left="3240" w:hanging="360"/>
+      </w:pPr>
+    </w:lvl>
+    <w:lvl w:ilvl="4" w:tplc="04090019" w:tentative="1">
+      <w:start w:val="1"/>
+      <w:numFmt w:val="lowerLetter"/>
+      <w:lvlText w:val="%5."/>
+      <w:lvlJc w:val="left"/>
+      <w:pPr>
+        <w:ind w:left="3960" w:hanging="360"/>
+      </w:pPr>
+    </w:lvl>
+    <w:lvl w:ilvl="5" w:tplc="0409001B" w:tentative="1">
+      <w:start w:val="1"/>
+      <w:numFmt w:val="lowerRoman"/>
+      <w:lvlText w:val="%6."/>
+      <w:lvlJc w:val="right"/>
+      <w:pPr>
+        <w:ind w:left="4680" w:hanging="180"/>
+      </w:pPr>
+    </w:lvl>
+    <w:lvl w:ilvl="6" w:tplc="0409000F" w:tentative="1">
+      <w:start w:val="1"/>
+      <w:numFmt w:val="decimal"/>
+      <w:lvlText w:val="%7."/>
+      <w:lvlJc w:val="left"/>
+      <w:pPr>
+        <w:ind w:left="5400" w:hanging="360"/>
+      </w:pPr>
+    </w:lvl>
+    <w:lvl w:ilvl="7" w:tplc="04090019" w:tentative="1">
+      <w:start w:val="1"/>
+      <w:numFmt w:val="lowerLetter"/>
+      <w:lvlText w:val="%8."/>
+      <w:lvlJc w:val="left"/>
+      <w:pPr>
+        <w:ind w:left="6120" w:hanging="360"/>
+      </w:pPr>
+    </w:lvl>
+    <w:lvl w:ilvl="8" w:tplc="0409001B" w:tentative="1">
+      <w:start w:val="1"/>
+      <w:numFmt w:val="lowerRoman"/>
+      <w:lvlText w:val="%9."/>
+      <w:lvlJc w:val="right"/>
+      <w:pPr>
+        <w:ind w:left="6840" w:hanging="180"/>
+      </w:pPr>
+    </w:lvl>
+  </w:abstractNum>
+  <w:abstractNum w:abstractNumId="4" w15:restartNumberingAfterBreak="0">
     <w:nsid w:val="6C484D90"/>
     <w:multiLevelType w:val="hybridMultilevel"/>
     <w:tmpl w:val="6DA81D0E"/>
@@ -794,13 +1415,19 @@
     </w:lvl>
   </w:abstractNum>
   <w:num w:numId="1" w16cid:durableId="1168402056">
+    <w:abstractNumId w:val="4"/>
+  </w:num>
+  <w:num w:numId="2" w16cid:durableId="810832052">
+    <w:abstractNumId w:val="1"/>
+  </w:num>
+  <w:num w:numId="3" w16cid:durableId="1419867015">
     <w:abstractNumId w:val="2"/>
   </w:num>
-  <w:num w:numId="2" w16cid:durableId="810832052">
+  <w:num w:numId="4" w16cid:durableId="1716001034">
     <w:abstractNumId w:val="0"/>
   </w:num>
-  <w:num w:numId="3" w16cid:durableId="1419867015">
-    <w:abstractNumId w:val="1"/>
+  <w:num w:numId="5" w16cid:durableId="139002228">
+    <w:abstractNumId w:val="3"/>
   </w:num>
 </w:numbering>
 </file>

</xml_diff>